<commit_message>
Recap drafts 10/13: Kerry's blind ruling (#1765), Straiton $235.50
Co-Authored-By: Claude Opus 5.5 <noreply@anthropic.com>
Claude-Session: https://claude.ai/code/session_019AxFcHia31na5NB3RLsF2W
</commit_message>
<xml_diff>
--- a/transaction-tracker/docs/claude/recaps/TGF_Recap_a9.27_Forest_Creek.docx
+++ b/transaction-tracker/docs/claude/recaps/TGF_Recap_a9.27_Forest_Creek.docx
@@ -82,7 +82,7 @@
       <w:pPr>
         <w:spacing w:after="0" w:line="276"/>
       </w:pPr>
-      <w:hyperlink w:history="1" r:id="rIdjbcxdbudyznyikblegnk4">
+      <w:hyperlink w:history="1" r:id="rIdcnxhix5bxkd0bftdum9-u">
         <w:r>
           <w:rPr>
             <w:rStyle w:val="Hyperlink"/>
@@ -103,7 +103,7 @@
         </w:rPr>
         <w:t xml:space="preserve"> had gone 40, 39 and 40 on his last three Tuesdays. At Forest Creek he shot 32 (−4) from the Blues — birdies on 3, 4, 5, 6 and 8, five in six holes — for 30 net (−6) and 15 points. That won Individual Net and four skins, made him Austin's City MVP, and took the TGF MVP across both chapters, four clear of San Antonio's </w:t>
       </w:r>
-      <w:hyperlink w:history="1" r:id="rIdzeoek8lgxxlms5-uze6qm">
+      <w:hyperlink w:history="1" r:id="rIdadencuedh-vlflevgwocj">
         <w:r>
           <w:rPr>
             <w:rStyle w:val="Hyperlink"/>
@@ -124,7 +124,7 @@
         </w:rPr>
         <w:t xml:space="preserve"> (11 at The Quarry). He and </w:t>
       </w:r>
-      <w:hyperlink w:history="1" r:id="rIdl_ulul-yi61ohndlgbjip">
+      <w:hyperlink w:history="1" r:id="rIdtndb9vkbroej5gyqxm4ti">
         <w:r>
           <w:rPr>
             <w:rStyle w:val="Hyperlink"/>
@@ -153,7 +153,7 @@
           <w:sz w:val="22"/>
           <w:szCs w:val="22"/>
         </w:rPr>
-        <w:t xml:space="preserve">A [__ $235.50 / $248.50 __] night.</w:t>
+        <w:t xml:space="preserve">A $235.50 night.</w:t>
       </w:r>
     </w:p>
     <w:p>
@@ -173,7 +173,7 @@
       <w:pPr>
         <w:spacing w:after="0" w:line="276"/>
       </w:pPr>
-      <w:hyperlink w:history="1" r:id="rId2acnrvg_b5oq7xd8gh-s4">
+      <w:hyperlink w:history="1" r:id="rIduhxuyolyvkr1e4wrvsilp">
         <w:r>
           <w:rPr>
             <w:rStyle w:val="Hyperlink"/>
@@ -194,7 +194,7 @@
         </w:rPr>
         <w:t xml:space="preserve"> was second in Individual Net at 35 net (−1). </w:t>
       </w:r>
-      <w:hyperlink w:history="1" r:id="rIdw9bpzvgbdktfzghfqmwev">
+      <w:hyperlink w:history="1" r:id="rIdfclbptchvwp5pwfkghcue">
         <w:r>
           <w:rPr>
             <w:rStyle w:val="Hyperlink"/>
@@ -215,7 +215,7 @@
         </w:rPr>
         <w:t xml:space="preserve"> won three skins in the second flight, including a birdie on the par-3 6th, and </w:t>
       </w:r>
-      <w:hyperlink w:history="1" r:id="rIdtlpstjljpflpzsoitpw6q">
+      <w:hyperlink w:history="1" r:id="rId83jhcw5wu3v4dwycu3oem">
         <w:r>
           <w:rPr>
             <w:rStyle w:val="Hyperlink"/>
@@ -236,7 +236,7 @@
         </w:rPr>
         <w:t xml:space="preserve">, </w:t>
       </w:r>
-      <w:hyperlink w:history="1" r:id="rIdviwzlbyk8bot63m-rmj1c">
+      <w:hyperlink w:history="1" r:id="rIdk1tsabgoemzpca_fgwqqx">
         <w:r>
           <w:rPr>
             <w:rStyle w:val="Hyperlink"/>
@@ -257,7 +257,7 @@
         </w:rPr>
         <w:t xml:space="preserve"> and </w:t>
       </w:r>
-      <w:hyperlink w:history="1" r:id="rIdgwo19p569iqibkcjzhgz_">
+      <w:hyperlink w:history="1" r:id="rId04oridh5v66jbr1v4rapg">
         <w:r>
           <w:rPr>
             <w:rStyle w:val="Hyperlink"/>
@@ -278,7 +278,7 @@
         </w:rPr>
         <w:t xml:space="preserve"> took one each. </w:t>
       </w:r>
-      <w:hyperlink w:history="1" r:id="rIdqjkthczyj4ghlnkfcsysk">
+      <w:hyperlink w:history="1" r:id="rIdb8bidkmj7tiackdgp6brc">
         <w:r>
           <w:rPr>
             <w:rStyle w:val="Hyperlink"/>
@@ -299,7 +299,7 @@
         </w:rPr>
         <w:t xml:space="preserve"> took second in CART Net with his "blind." </w:t>
       </w:r>
-      <w:hyperlink w:history="1" r:id="rIdz4o1x_n1tnam7jpvqlwpf">
+      <w:hyperlink w:history="1" r:id="rIdvxuogwtpzkxga4fnjzbhi">
         <w:r>
           <w:rPr>
             <w:rStyle w:val="Hyperlink"/>
@@ -338,7 +338,7 @@
       <w:pPr>
         <w:spacing w:after="0" w:line="276"/>
       </w:pPr>
-      <w:hyperlink w:history="1" r:id="rId31dpj8jpixqlf-l7pbenv">
+      <w:hyperlink w:history="1" r:id="rIdpcb_hpr-m5_fariuc01vi">
         <w:r>
           <w:rPr>
             <w:rStyle w:val="Hyperlink"/>
@@ -393,7 +393,7 @@
       <w:pPr>
         <w:spacing w:after="0" w:line="276"/>
       </w:pPr>
-      <w:hyperlink w:history="1" r:id="rIdff0rnpqoov-ufkmzot_6e">
+      <w:hyperlink w:history="1" r:id="rIdi_bahypt_zadd6knm5j_0">
         <w:r>
           <w:rPr>
             <w:rStyle w:val="Hyperlink"/>
@@ -414,7 +414,7 @@
         </w:rPr>
         <w:t xml:space="preserve"> still leads at 62, with </w:t>
       </w:r>
-      <w:hyperlink w:history="1" r:id="rIddj8duguc7egevici7ldhq">
+      <w:hyperlink w:history="1" r:id="rIdhxi1lhoabryoh5lq_rlqg">
         <w:r>
           <w:rPr>
             <w:rStyle w:val="Hyperlink"/>
@@ -435,7 +435,7 @@
         </w:rPr>
         <w:t xml:space="preserve"> at 50, </w:t>
       </w:r>
-      <w:hyperlink w:history="1" r:id="rIdcfwfo5qlxaahrte901fvg">
+      <w:hyperlink w:history="1" r:id="rIdgmidwm4aelh_kahdifwmr">
         <w:r>
           <w:rPr>
             <w:rStyle w:val="Hyperlink"/>
@@ -456,7 +456,7 @@
         </w:rPr>
         <w:t xml:space="preserve"> at 43 and </w:t>
       </w:r>
-      <w:hyperlink w:history="1" r:id="rIdgoaoqvtskriogn1gijxc-">
+      <w:hyperlink w:history="1" r:id="rIdnd1iwfrpjwkg3smylypwx">
         <w:r>
           <w:rPr>
             <w:rStyle w:val="Hyperlink"/>
@@ -477,7 +477,7 @@
         </w:rPr>
         <w:t xml:space="preserve"> at 35. Best 6 of the fall Tuesdays plus the Fall Championship at Kissing Tree on Oct 31. Your points are being tallied; activate them by </w:t>
       </w:r>
-      <w:hyperlink w:history="1" r:id="rId_kxazlondcexfhr1fwn1l">
+      <w:hyperlink w:history="1" r:id="rIdjmlfopikbgpvkcar18lai">
         <w:r>
           <w:rPr>
             <w:rStyle w:val="Hyperlink"/>
@@ -516,7 +516,7 @@
       <w:pPr>
         <w:spacing w:after="0" w:line="276"/>
       </w:pPr>
-      <w:hyperlink w:history="1" w:anchor="race=fall_austin" r:id="rIdup_jmcgsxp7iccu-_aprc">
+      <w:hyperlink w:history="1" w:anchor="race=fall_austin" r:id="rIddbhjm4eyf9jb6yzhwq2c9">
         <w:r>
           <w:rPr>
             <w:rStyle w:val="Hyperlink"/>
@@ -537,7 +537,7 @@
         </w:rPr>
         <w:t xml:space="preserve"> | </w:t>
       </w:r>
-      <w:hyperlink w:history="1" w:anchor="race=fall_sa" r:id="rIdmftgrnegsoartthksz7op">
+      <w:hyperlink w:history="1" w:anchor="race=fall_sa" r:id="rId_8mpqur80ld0kgibusbvl">
         <w:r>
           <w:rPr>
             <w:rStyle w:val="Hyperlink"/>
@@ -600,7 +600,7 @@
         </w:rPr>
         <w:t xml:space="preserve">Every member is in automatically, no buy-in required. Winner takes all — $139 at month end, $1 per TGF member. </w:t>
       </w:r>
-      <w:hyperlink w:history="1" r:id="rIdmzctjh1fbhowgcxq1vvqd">
+      <w:hyperlink w:history="1" r:id="rIdivzdqhnal4htwyfgt0ps5">
         <w:r>
           <w:rPr>
             <w:rStyle w:val="Hyperlink"/>
@@ -621,7 +621,7 @@
         </w:rPr>
         <w:t xml:space="preserve"> leads with 22, with San Antonio's </w:t>
       </w:r>
-      <w:hyperlink w:history="1" r:id="rIdutwbtrxgti3kr8506j_1g">
+      <w:hyperlink w:history="1" r:id="rIdslngxmtoyjicr3pdbm0vg">
         <w:r>
           <w:rPr>
             <w:rStyle w:val="Hyperlink"/>
@@ -642,7 +642,7 @@
         </w:rPr>
         <w:t xml:space="preserve"> at 19 and </w:t>
       </w:r>
-      <w:hyperlink w:history="1" r:id="rIdpnlinx-y32ppvagrmddno">
+      <w:hyperlink w:history="1" r:id="rIdziam5neuajkfkyky9hlky">
         <w:r>
           <w:rPr>
             <w:rStyle w:val="Hyperlink"/>
@@ -681,7 +681,7 @@
       <w:pPr>
         <w:spacing w:after="0" w:line="276"/>
       </w:pPr>
-      <w:hyperlink w:history="1" w:anchor="race=monthly" r:id="rIdzke1-4c7lduynosidie6f">
+      <w:hyperlink w:history="1" w:anchor="race=monthly" r:id="rIdkujk85r1l7pabli2pjm2c">
         <w:r>
           <w:rPr>
             <w:rStyle w:val="Hyperlink"/>
@@ -903,7 +903,7 @@
         </w:rPr>
         <w:t xml:space="preserve"> | </w:t>
       </w:r>
-      <w:hyperlink w:history="1" r:id="rIdih6o3meicksczy1qfu7t9">
+      <w:hyperlink w:history="1" r:id="rIdxwxhqn73dqivppxyhxwah">
         <w:r>
           <w:rPr>
             <w:rStyle w:val="Hyperlink"/>
@@ -960,7 +960,7 @@
         </w:rPr>
         <w:t xml:space="preserve"> | </w:t>
       </w:r>
-      <w:hyperlink w:history="1" r:id="rId2fyfzwr5evag3h7hb9q6l">
+      <w:hyperlink w:history="1" r:id="rIdyabd-2n20dlrrs9-6ujsd">
         <w:r>
           <w:rPr>
             <w:rStyle w:val="Hyperlink"/>
@@ -1036,7 +1036,7 @@
         </w:rPr>
         <w:t xml:space="preserve"> | </w:t>
       </w:r>
-      <w:hyperlink w:history="1" r:id="rId3vojhidh8g6o3vldwx3cs">
+      <w:hyperlink w:history="1" r:id="rId2zewgwybhauuacuiw6qkk">
         <w:r>
           <w:rPr>
             <w:rStyle w:val="Hyperlink"/>
@@ -1103,7 +1103,7 @@
         </w:rPr>
         <w:t xml:space="preserve"> | Kissing Tree — both chapters | </w:t>
       </w:r>
-      <w:hyperlink w:history="1" r:id="rIdu4ofvuztvkao5iinwddp8">
+      <w:hyperlink w:history="1" r:id="rIdy6luykumqz2offpf5rm6y">
         <w:r>
           <w:rPr>
             <w:rStyle w:val="Hyperlink"/>

</xml_diff>

<commit_message>
Recap drafts 10/13: Stich in the Ind Net F2 tie, Doggett T2 in Austin (recorded payouts)
Co-Authored-By: Claude Opus 5.5 <noreply@anthropic.com>
Claude-Session: https://claude.ai/code/session_019AxFcHia31na5NB3RLsF2W
</commit_message>
<xml_diff>
--- a/transaction-tracker/docs/claude/recaps/TGF_Recap_a9.27_Forest_Creek.docx
+++ b/transaction-tracker/docs/claude/recaps/TGF_Recap_a9.27_Forest_Creek.docx
@@ -82,7 +82,7 @@
       <w:pPr>
         <w:spacing w:after="0" w:line="276"/>
       </w:pPr>
-      <w:hyperlink w:history="1" r:id="rIdcnxhix5bxkd0bftdum9-u">
+      <w:hyperlink w:history="1" r:id="rIdhx6i_gwhoxob4zhgpvjew">
         <w:r>
           <w:rPr>
             <w:rStyle w:val="Hyperlink"/>
@@ -103,7 +103,7 @@
         </w:rPr>
         <w:t xml:space="preserve"> had gone 40, 39 and 40 on his last three Tuesdays. At Forest Creek he shot 32 (−4) from the Blues — birdies on 3, 4, 5, 6 and 8, five in six holes — for 30 net (−6) and 15 points. That won Individual Net and four skins, made him Austin's City MVP, and took the TGF MVP across both chapters, four clear of San Antonio's </w:t>
       </w:r>
-      <w:hyperlink w:history="1" r:id="rIdadencuedh-vlflevgwocj">
+      <w:hyperlink w:history="1" r:id="rIdkolv8ytzneeh8mv1zspdh">
         <w:r>
           <w:rPr>
             <w:rStyle w:val="Hyperlink"/>
@@ -124,7 +124,7 @@
         </w:rPr>
         <w:t xml:space="preserve"> (11 at The Quarry). He and </w:t>
       </w:r>
-      <w:hyperlink w:history="1" r:id="rIdtndb9vkbroej5gyqxm4ti">
+      <w:hyperlink w:history="1" r:id="rId8vz3kfjfzfzdhocjmq5c0">
         <w:r>
           <w:rPr>
             <w:rStyle w:val="Hyperlink"/>
@@ -173,7 +173,7 @@
       <w:pPr>
         <w:spacing w:after="0" w:line="276"/>
       </w:pPr>
-      <w:hyperlink w:history="1" r:id="rIduhxuyolyvkr1e4wrvsilp">
+      <w:hyperlink w:history="1" r:id="rId_7kixp6xjeixababfvhls">
         <w:r>
           <w:rPr>
             <w:rStyle w:val="Hyperlink"/>
@@ -192,9 +192,30 @@
           <w:sz w:val="22"/>
           <w:szCs w:val="22"/>
         </w:rPr>
-        <w:t xml:space="preserve"> was second in Individual Net at 35 net (−1). </w:t>
-      </w:r>
-      <w:hyperlink w:history="1" r:id="rIdfclbptchvwp5pwfkghcue">
+        <w:t xml:space="preserve"> and </w:t>
+      </w:r>
+      <w:hyperlink w:history="1" r:id="rIddjnzxxzk5hvxfqxmrj7bh">
+        <w:r>
+          <w:rPr>
+            <w:rStyle w:val="Hyperlink"/>
+            <w:rFonts w:ascii="Arial" w:cs="Arial" w:eastAsia="Arial" w:hAnsi="Arial"/>
+            <w:b/>
+            <w:bCs/>
+            <w:sz w:val="22"/>
+            <w:szCs w:val="22"/>
+          </w:rPr>
+          <w:t xml:space="preserve">Bryce DOGGETT</w:t>
+        </w:r>
+      </w:hyperlink>
+      <w:r>
+        <w:rPr>
+          <w:rFonts w:ascii="Arial" w:cs="Arial" w:eastAsia="Arial" w:hAnsi="Arial"/>
+          <w:sz w:val="22"/>
+          <w:szCs w:val="22"/>
+        </w:rPr>
+        <w:t xml:space="preserve"> tied for second in Individual Net at 35 net (−1), Bryce from the Whites with a 38 (+2). </w:t>
+      </w:r>
+      <w:hyperlink w:history="1" r:id="rIdm--7i4h2sjs-k_-uwzxf8">
         <w:r>
           <w:rPr>
             <w:rStyle w:val="Hyperlink"/>
@@ -215,7 +236,7 @@
         </w:rPr>
         <w:t xml:space="preserve"> won three skins in the second flight, including a birdie on the par-3 6th, and </w:t>
       </w:r>
-      <w:hyperlink w:history="1" r:id="rId83jhcw5wu3v4dwycu3oem">
+      <w:hyperlink w:history="1" r:id="rId5_k_ro7dkxu-3wkzfc2o0">
         <w:r>
           <w:rPr>
             <w:rStyle w:val="Hyperlink"/>
@@ -236,7 +257,7 @@
         </w:rPr>
         <w:t xml:space="preserve">, </w:t>
       </w:r>
-      <w:hyperlink w:history="1" r:id="rIdk1tsabgoemzpca_fgwqqx">
+      <w:hyperlink w:history="1" r:id="rIdxjxxhcnjsrgqtdcklxia1">
         <w:r>
           <w:rPr>
             <w:rStyle w:val="Hyperlink"/>
@@ -257,7 +278,7 @@
         </w:rPr>
         <w:t xml:space="preserve"> and </w:t>
       </w:r>
-      <w:hyperlink w:history="1" r:id="rId04oridh5v66jbr1v4rapg">
+      <w:hyperlink w:history="1" r:id="rIdekuc2p1uigvrrysyyk2tv">
         <w:r>
           <w:rPr>
             <w:rStyle w:val="Hyperlink"/>
@@ -278,7 +299,7 @@
         </w:rPr>
         <w:t xml:space="preserve"> took one each. </w:t>
       </w:r>
-      <w:hyperlink w:history="1" r:id="rIdb8bidkmj7tiackdgp6brc">
+      <w:hyperlink w:history="1" r:id="rIdydp1ux56vlf7dsvmtds8j">
         <w:r>
           <w:rPr>
             <w:rStyle w:val="Hyperlink"/>
@@ -297,28 +318,7 @@
           <w:sz w:val="22"/>
           <w:szCs w:val="22"/>
         </w:rPr>
-        <w:t xml:space="preserve"> took second in CART Net with his "blind." </w:t>
-      </w:r>
-      <w:hyperlink w:history="1" r:id="rIdvxuogwtpzkxga4fnjzbhi">
-        <w:r>
-          <w:rPr>
-            <w:rStyle w:val="Hyperlink"/>
-            <w:rFonts w:ascii="Arial" w:cs="Arial" w:eastAsia="Arial" w:hAnsi="Arial"/>
-            <w:b/>
-            <w:bCs/>
-            <w:sz w:val="22"/>
-            <w:szCs w:val="22"/>
-          </w:rPr>
-          <w:t xml:space="preserve">Bryce DOGGETT</w:t>
-        </w:r>
-      </w:hyperlink>
-      <w:r>
-        <w:rPr>
-          <w:rFonts w:ascii="Arial" w:cs="Arial" w:eastAsia="Arial" w:hAnsi="Arial"/>
-          <w:sz w:val="22"/>
-          <w:szCs w:val="22"/>
-        </w:rPr>
-        <w:t xml:space="preserve"> shot 38 (+2) from the Whites. Eight of the 13 cashed something Tuesday. Every hole is an opportunity to win in Skins, and everyone has a chance!</w:t>
+        <w:t xml:space="preserve"> took second in CART Net with his "blind." Nine of the 13 cashed something Tuesday. Every hole is an opportunity to win in Skins, and everyone has a chance!</w:t>
       </w:r>
     </w:p>
     <w:p>
@@ -338,7 +338,7 @@
       <w:pPr>
         <w:spacing w:after="0" w:line="276"/>
       </w:pPr>
-      <w:hyperlink w:history="1" r:id="rIdpcb_hpr-m5_fariuc01vi">
+      <w:hyperlink w:history="1" r:id="rId44eqwmkehkecqkhvj9nw1">
         <w:r>
           <w:rPr>
             <w:rStyle w:val="Hyperlink"/>
@@ -393,7 +393,7 @@
       <w:pPr>
         <w:spacing w:after="0" w:line="276"/>
       </w:pPr>
-      <w:hyperlink w:history="1" r:id="rIdi_bahypt_zadd6knm5j_0">
+      <w:hyperlink w:history="1" r:id="rIdkoquqsmtoiomvg6vh-fao">
         <w:r>
           <w:rPr>
             <w:rStyle w:val="Hyperlink"/>
@@ -414,7 +414,7 @@
         </w:rPr>
         <w:t xml:space="preserve"> still leads at 62, with </w:t>
       </w:r>
-      <w:hyperlink w:history="1" r:id="rIdhxi1lhoabryoh5lq_rlqg">
+      <w:hyperlink w:history="1" r:id="rId_3sbxnnm1_gp8h7hsmzj9">
         <w:r>
           <w:rPr>
             <w:rStyle w:val="Hyperlink"/>
@@ -435,7 +435,7 @@
         </w:rPr>
         <w:t xml:space="preserve"> at 50, </w:t>
       </w:r>
-      <w:hyperlink w:history="1" r:id="rIdgmidwm4aelh_kahdifwmr">
+      <w:hyperlink w:history="1" r:id="rId9cecz_toeg7tiskwtehww">
         <w:r>
           <w:rPr>
             <w:rStyle w:val="Hyperlink"/>
@@ -456,7 +456,7 @@
         </w:rPr>
         <w:t xml:space="preserve"> at 43 and </w:t>
       </w:r>
-      <w:hyperlink w:history="1" r:id="rIdnd1iwfrpjwkg3smylypwx">
+      <w:hyperlink w:history="1" r:id="rIdxyeezsxqeeky3abn-pudd">
         <w:r>
           <w:rPr>
             <w:rStyle w:val="Hyperlink"/>
@@ -477,7 +477,7 @@
         </w:rPr>
         <w:t xml:space="preserve"> at 35. Best 6 of the fall Tuesdays plus the Fall Championship at Kissing Tree on Oct 31. Your points are being tallied; activate them by </w:t>
       </w:r>
-      <w:hyperlink w:history="1" r:id="rIdjmlfopikbgpvkcar18lai">
+      <w:hyperlink w:history="1" r:id="rIdegryozj6tiszgiaj8_sp5">
         <w:r>
           <w:rPr>
             <w:rStyle w:val="Hyperlink"/>
@@ -516,7 +516,7 @@
       <w:pPr>
         <w:spacing w:after="0" w:line="276"/>
       </w:pPr>
-      <w:hyperlink w:history="1" w:anchor="race=fall_austin" r:id="rIddbhjm4eyf9jb6yzhwq2c9">
+      <w:hyperlink w:history="1" w:anchor="race=fall_austin" r:id="rIdc0xmq2oeu9xxtqozfdh6t">
         <w:r>
           <w:rPr>
             <w:rStyle w:val="Hyperlink"/>
@@ -537,7 +537,7 @@
         </w:rPr>
         <w:t xml:space="preserve"> | </w:t>
       </w:r>
-      <w:hyperlink w:history="1" w:anchor="race=fall_sa" r:id="rId_8mpqur80ld0kgibusbvl">
+      <w:hyperlink w:history="1" w:anchor="race=fall_sa" r:id="rIdisouo4e1abxkgummajpe8">
         <w:r>
           <w:rPr>
             <w:rStyle w:val="Hyperlink"/>
@@ -600,7 +600,7 @@
         </w:rPr>
         <w:t xml:space="preserve">Every member is in automatically, no buy-in required. Winner takes all — $139 at month end, $1 per TGF member. </w:t>
       </w:r>
-      <w:hyperlink w:history="1" r:id="rIdivzdqhnal4htwyfgt0ps5">
+      <w:hyperlink w:history="1" r:id="rIdf-dcgcw6nzq-8qamkbn0z">
         <w:r>
           <w:rPr>
             <w:rStyle w:val="Hyperlink"/>
@@ -621,7 +621,7 @@
         </w:rPr>
         <w:t xml:space="preserve"> leads with 22, with San Antonio's </w:t>
       </w:r>
-      <w:hyperlink w:history="1" r:id="rIdslngxmtoyjicr3pdbm0vg">
+      <w:hyperlink w:history="1" r:id="rIdovx_nbhtnm16bxfcijlca">
         <w:r>
           <w:rPr>
             <w:rStyle w:val="Hyperlink"/>
@@ -642,7 +642,7 @@
         </w:rPr>
         <w:t xml:space="preserve"> at 19 and </w:t>
       </w:r>
-      <w:hyperlink w:history="1" r:id="rIdziam5neuajkfkyky9hlky">
+      <w:hyperlink w:history="1" r:id="rIduzlczkdpmqtoeel9anqfe">
         <w:r>
           <w:rPr>
             <w:rStyle w:val="Hyperlink"/>
@@ -681,7 +681,7 @@
       <w:pPr>
         <w:spacing w:after="0" w:line="276"/>
       </w:pPr>
-      <w:hyperlink w:history="1" w:anchor="race=monthly" r:id="rIdkujk85r1l7pabli2pjm2c">
+      <w:hyperlink w:history="1" w:anchor="race=monthly" r:id="rIdpfccnhmudfd16rzvikxrp">
         <w:r>
           <w:rPr>
             <w:rStyle w:val="Hyperlink"/>
@@ -903,7 +903,7 @@
         </w:rPr>
         <w:t xml:space="preserve"> | </w:t>
       </w:r>
-      <w:hyperlink w:history="1" r:id="rIdxwxhqn73dqivppxyhxwah">
+      <w:hyperlink w:history="1" r:id="rIdf-od1aosohb_1n_tevplt">
         <w:r>
           <w:rPr>
             <w:rStyle w:val="Hyperlink"/>
@@ -960,7 +960,7 @@
         </w:rPr>
         <w:t xml:space="preserve"> | </w:t>
       </w:r>
-      <w:hyperlink w:history="1" r:id="rIdyabd-2n20dlrrs9-6ujsd">
+      <w:hyperlink w:history="1" r:id="rIdco1qweehgbly1qlp3qgra">
         <w:r>
           <w:rPr>
             <w:rStyle w:val="Hyperlink"/>
@@ -1036,7 +1036,7 @@
         </w:rPr>
         <w:t xml:space="preserve"> | </w:t>
       </w:r>
-      <w:hyperlink w:history="1" r:id="rId2zewgwybhauuacuiw6qkk">
+      <w:hyperlink w:history="1" r:id="rIdpcrbvfthgkptzahxbb7ld">
         <w:r>
           <w:rPr>
             <w:rStyle w:val="Hyperlink"/>
@@ -1103,7 +1103,7 @@
         </w:rPr>
         <w:t xml:space="preserve"> | Kissing Tree — both chapters | </w:t>
       </w:r>
-      <w:hyperlink w:history="1" r:id="rIdy6luykumqz2offpf5rm6y">
+      <w:hyperlink w:history="1" r:id="rId2r83teyfb1h3tfwj-_t18">
         <w:r>
           <w:rPr>
             <w:rStyle w:val="Hyperlink"/>

</xml_diff>

<commit_message>
v2.563.5: /member/results/<event id> opens that event; recaps link to it
Co-Authored-By: Claude Opus 5.5 <noreply@anthropic.com>
Claude-Session: https://claude.ai/code/session_019AxFcHia31na5NB3RLsF2W
</commit_message>
<xml_diff>
--- a/transaction-tracker/docs/claude/recaps/TGF_Recap_a9.27_Forest_Creek.docx
+++ b/transaction-tracker/docs/claude/recaps/TGF_Recap_a9.27_Forest_Creek.docx
@@ -82,7 +82,7 @@
       <w:pPr>
         <w:spacing w:after="0" w:line="276"/>
       </w:pPr>
-      <w:hyperlink w:history="1" r:id="rIdhx6i_gwhoxob4zhgpvjew">
+      <w:hyperlink w:history="1" r:id="rIdhjweenw5bfjwx1r7yqya-">
         <w:r>
           <w:rPr>
             <w:rStyle w:val="Hyperlink"/>
@@ -103,7 +103,7 @@
         </w:rPr>
         <w:t xml:space="preserve"> had gone 40, 39 and 40 on his last three Tuesdays. At Forest Creek he shot 32 (−4) from the Blues — birdies on 3, 4, 5, 6 and 8, five in six holes — for 30 net (−6) and 15 points. That won Individual Net and four skins, made him Austin's City MVP, and took the TGF MVP across both chapters, four clear of San Antonio's </w:t>
       </w:r>
-      <w:hyperlink w:history="1" r:id="rIdkolv8ytzneeh8mv1zspdh">
+      <w:hyperlink w:history="1" r:id="rIdreuvnj_tzjpshrmfnm6m9">
         <w:r>
           <w:rPr>
             <w:rStyle w:val="Hyperlink"/>
@@ -124,7 +124,7 @@
         </w:rPr>
         <w:t xml:space="preserve"> (11 at The Quarry). He and </w:t>
       </w:r>
-      <w:hyperlink w:history="1" r:id="rId8vz3kfjfzfzdhocjmq5c0">
+      <w:hyperlink w:history="1" r:id="rIdpdkbk51hvo4pdyqmbktmk">
         <w:r>
           <w:rPr>
             <w:rStyle w:val="Hyperlink"/>
@@ -173,7 +173,7 @@
       <w:pPr>
         <w:spacing w:after="0" w:line="276"/>
       </w:pPr>
-      <w:hyperlink w:history="1" r:id="rId_7kixp6xjeixababfvhls">
+      <w:hyperlink w:history="1" r:id="rIdaotvhyrsyqlguyrm57v43">
         <w:r>
           <w:rPr>
             <w:rStyle w:val="Hyperlink"/>
@@ -194,7 +194,7 @@
         </w:rPr>
         <w:t xml:space="preserve"> and </w:t>
       </w:r>
-      <w:hyperlink w:history="1" r:id="rIddjnzxxzk5hvxfqxmrj7bh">
+      <w:hyperlink w:history="1" r:id="rIdcsgpf-62vhozu0xcfp1sv">
         <w:r>
           <w:rPr>
             <w:rStyle w:val="Hyperlink"/>
@@ -215,7 +215,7 @@
         </w:rPr>
         <w:t xml:space="preserve"> tied for second in Individual Net at 35 net (−1), Bryce from the Whites with a 38 (+2). </w:t>
       </w:r>
-      <w:hyperlink w:history="1" r:id="rIdm--7i4h2sjs-k_-uwzxf8">
+      <w:hyperlink w:history="1" r:id="rIdhlinl3cqhr5ygactgsq_h">
         <w:r>
           <w:rPr>
             <w:rStyle w:val="Hyperlink"/>
@@ -236,7 +236,7 @@
         </w:rPr>
         <w:t xml:space="preserve"> won three skins in the second flight, including a birdie on the par-3 6th, and </w:t>
       </w:r>
-      <w:hyperlink w:history="1" r:id="rId5_k_ro7dkxu-3wkzfc2o0">
+      <w:hyperlink w:history="1" r:id="rIdj4yik3oogybv8v8zqqzbq">
         <w:r>
           <w:rPr>
             <w:rStyle w:val="Hyperlink"/>
@@ -257,7 +257,7 @@
         </w:rPr>
         <w:t xml:space="preserve">, </w:t>
       </w:r>
-      <w:hyperlink w:history="1" r:id="rIdxjxxhcnjsrgqtdcklxia1">
+      <w:hyperlink w:history="1" r:id="rIdmpl32qzeqdmjicikjzgdk">
         <w:r>
           <w:rPr>
             <w:rStyle w:val="Hyperlink"/>
@@ -278,7 +278,7 @@
         </w:rPr>
         <w:t xml:space="preserve"> and </w:t>
       </w:r>
-      <w:hyperlink w:history="1" r:id="rIdekuc2p1uigvrrysyyk2tv">
+      <w:hyperlink w:history="1" r:id="rIdwoavz1rgumebwmav7d-pt">
         <w:r>
           <w:rPr>
             <w:rStyle w:val="Hyperlink"/>
@@ -299,7 +299,7 @@
         </w:rPr>
         <w:t xml:space="preserve"> took one each. </w:t>
       </w:r>
-      <w:hyperlink w:history="1" r:id="rIdydp1ux56vlf7dsvmtds8j">
+      <w:hyperlink w:history="1" r:id="rIdfenepf4ap65rnsnioenmn">
         <w:r>
           <w:rPr>
             <w:rStyle w:val="Hyperlink"/>
@@ -338,7 +338,7 @@
       <w:pPr>
         <w:spacing w:after="0" w:line="276"/>
       </w:pPr>
-      <w:hyperlink w:history="1" r:id="rId44eqwmkehkecqkhvj9nw1">
+      <w:hyperlink w:history="1" r:id="rIdzpgkztl_vmippdczgkvde">
         <w:r>
           <w:rPr>
             <w:rStyle w:val="Hyperlink"/>
@@ -393,7 +393,7 @@
       <w:pPr>
         <w:spacing w:after="0" w:line="276"/>
       </w:pPr>
-      <w:hyperlink w:history="1" r:id="rIdkoquqsmtoiomvg6vh-fao">
+      <w:hyperlink w:history="1" r:id="rIdjqujv9gktohr5-v65enfm">
         <w:r>
           <w:rPr>
             <w:rStyle w:val="Hyperlink"/>
@@ -414,7 +414,7 @@
         </w:rPr>
         <w:t xml:space="preserve"> still leads at 62, with </w:t>
       </w:r>
-      <w:hyperlink w:history="1" r:id="rId_3sbxnnm1_gp8h7hsmzj9">
+      <w:hyperlink w:history="1" r:id="rIdktmup9knvdiyv30gz5ayq">
         <w:r>
           <w:rPr>
             <w:rStyle w:val="Hyperlink"/>
@@ -435,7 +435,7 @@
         </w:rPr>
         <w:t xml:space="preserve"> at 50, </w:t>
       </w:r>
-      <w:hyperlink w:history="1" r:id="rId9cecz_toeg7tiskwtehww">
+      <w:hyperlink w:history="1" r:id="rIdzdixsg6wq7srmwuwgjjx4">
         <w:r>
           <w:rPr>
             <w:rStyle w:val="Hyperlink"/>
@@ -456,7 +456,7 @@
         </w:rPr>
         <w:t xml:space="preserve"> at 43 and </w:t>
       </w:r>
-      <w:hyperlink w:history="1" r:id="rIdxyeezsxqeeky3abn-pudd">
+      <w:hyperlink w:history="1" r:id="rIdgj8eoxmc5g4b-rsthoqw8">
         <w:r>
           <w:rPr>
             <w:rStyle w:val="Hyperlink"/>
@@ -477,7 +477,7 @@
         </w:rPr>
         <w:t xml:space="preserve"> at 35. Best 6 of the fall Tuesdays plus the Fall Championship at Kissing Tree on Oct 31. Your points are being tallied; activate them by </w:t>
       </w:r>
-      <w:hyperlink w:history="1" r:id="rIdegryozj6tiszgiaj8_sp5">
+      <w:hyperlink w:history="1" r:id="rId8d9ljbacuohcqcybpju_d">
         <w:r>
           <w:rPr>
             <w:rStyle w:val="Hyperlink"/>
@@ -516,7 +516,7 @@
       <w:pPr>
         <w:spacing w:after="0" w:line="276"/>
       </w:pPr>
-      <w:hyperlink w:history="1" w:anchor="race=fall_austin" r:id="rIdc0xmq2oeu9xxtqozfdh6t">
+      <w:hyperlink w:history="1" w:anchor="race=fall_austin" r:id="rIdqwvnw09yw5tf_tml44ctq">
         <w:r>
           <w:rPr>
             <w:rStyle w:val="Hyperlink"/>
@@ -537,7 +537,7 @@
         </w:rPr>
         <w:t xml:space="preserve"> | </w:t>
       </w:r>
-      <w:hyperlink w:history="1" w:anchor="race=fall_sa" r:id="rIdisouo4e1abxkgummajpe8">
+      <w:hyperlink w:history="1" w:anchor="race=fall_sa" r:id="rIdoi6--hri0ygdr4qoswjwi">
         <w:r>
           <w:rPr>
             <w:rStyle w:val="Hyperlink"/>
@@ -600,7 +600,7 @@
         </w:rPr>
         <w:t xml:space="preserve">Every member is in automatically, no buy-in required. Winner takes all — $139 at month end, $1 per TGF member. </w:t>
       </w:r>
-      <w:hyperlink w:history="1" r:id="rIdf-dcgcw6nzq-8qamkbn0z">
+      <w:hyperlink w:history="1" r:id="rIdfmjz-n_7eitwvmvq0bhfl">
         <w:r>
           <w:rPr>
             <w:rStyle w:val="Hyperlink"/>
@@ -621,7 +621,7 @@
         </w:rPr>
         <w:t xml:space="preserve"> leads with 22, with San Antonio's </w:t>
       </w:r>
-      <w:hyperlink w:history="1" r:id="rIdovx_nbhtnm16bxfcijlca">
+      <w:hyperlink w:history="1" r:id="rIdrzhestheb9_gtv75zjo3_">
         <w:r>
           <w:rPr>
             <w:rStyle w:val="Hyperlink"/>
@@ -642,7 +642,7 @@
         </w:rPr>
         <w:t xml:space="preserve"> at 19 and </w:t>
       </w:r>
-      <w:hyperlink w:history="1" r:id="rIduzlczkdpmqtoeel9anqfe">
+      <w:hyperlink w:history="1" r:id="rIdk3u4ylql7lltwldnmhscp">
         <w:r>
           <w:rPr>
             <w:rStyle w:val="Hyperlink"/>
@@ -681,7 +681,7 @@
       <w:pPr>
         <w:spacing w:after="0" w:line="276"/>
       </w:pPr>
-      <w:hyperlink w:history="1" w:anchor="race=monthly" r:id="rIdpfccnhmudfd16rzvikxrp">
+      <w:hyperlink w:history="1" w:anchor="race=monthly" r:id="rIdfrq8mmhuxxlpqovuu8cum">
         <w:r>
           <w:rPr>
             <w:rStyle w:val="Hyperlink"/>
@@ -903,7 +903,7 @@
         </w:rPr>
         <w:t xml:space="preserve"> | </w:t>
       </w:r>
-      <w:hyperlink w:history="1" r:id="rIdf-od1aosohb_1n_tevplt">
+      <w:hyperlink w:history="1" r:id="rIdsqukg1orgxkssuxm8vtyp">
         <w:r>
           <w:rPr>
             <w:rStyle w:val="Hyperlink"/>
@@ -960,7 +960,7 @@
         </w:rPr>
         <w:t xml:space="preserve"> | </w:t>
       </w:r>
-      <w:hyperlink w:history="1" r:id="rIdco1qweehgbly1qlp3qgra">
+      <w:hyperlink w:history="1" r:id="rIdbwfsy2gn8uak_3mliqbye">
         <w:r>
           <w:rPr>
             <w:rStyle w:val="Hyperlink"/>
@@ -1036,7 +1036,7 @@
         </w:rPr>
         <w:t xml:space="preserve"> | </w:t>
       </w:r>
-      <w:hyperlink w:history="1" r:id="rIdpcrbvfthgkptzahxbb7ld">
+      <w:hyperlink w:history="1" r:id="rId-7xhijxbod-2czjh15big">
         <w:r>
           <w:rPr>
             <w:rStyle w:val="Hyperlink"/>
@@ -1103,7 +1103,7 @@
         </w:rPr>
         <w:t xml:space="preserve"> | Kissing Tree — both chapters | </w:t>
       </w:r>
-      <w:hyperlink w:history="1" r:id="rId2r83teyfb1h3tfwj-_t18">
+      <w:hyperlink w:history="1" r:id="rIdrszcfowykjml4rhktodnx">
         <w:r>
           <w:rPr>
             <w:rStyle w:val="Hyperlink"/>

</xml_diff>

<commit_message>
Recap drafts 10/13 v3: October lines after the engine fix re-scored points
Co-Authored-By: Claude Opus 5.5 <noreply@anthropic.com>
Claude-Session: https://claude.ai/code/session_019AxFcHia31na5NB3RLsF2W
</commit_message>
<xml_diff>
--- a/transaction-tracker/docs/claude/recaps/TGF_Recap_a9.27_Forest_Creek.docx
+++ b/transaction-tracker/docs/claude/recaps/TGF_Recap_a9.27_Forest_Creek.docx
@@ -82,7 +82,7 @@
       <w:pPr>
         <w:spacing w:after="0" w:line="276"/>
       </w:pPr>
-      <w:hyperlink w:history="1" r:id="rIdhjweenw5bfjwx1r7yqya-">
+      <w:hyperlink w:history="1" r:id="rIdyr8gpms0yernkt2iidhwj">
         <w:r>
           <w:rPr>
             <w:rStyle w:val="Hyperlink"/>
@@ -103,7 +103,7 @@
         </w:rPr>
         <w:t xml:space="preserve"> had gone 40, 39 and 40 on his last three Tuesdays. At Forest Creek he shot 32 (−4) from the Blues — birdies on 3, 4, 5, 6 and 8, five in six holes — for 30 net (−6) and 15 points. That won Individual Net and four skins, made him Austin's City MVP, and took the TGF MVP across both chapters, four clear of San Antonio's </w:t>
       </w:r>
-      <w:hyperlink w:history="1" r:id="rIdreuvnj_tzjpshrmfnm6m9">
+      <w:hyperlink w:history="1" r:id="rIdwzku1s37vyf-xk_b-xpgu">
         <w:r>
           <w:rPr>
             <w:rStyle w:val="Hyperlink"/>
@@ -124,7 +124,7 @@
         </w:rPr>
         <w:t xml:space="preserve"> (11 at The Quarry). He and </w:t>
       </w:r>
-      <w:hyperlink w:history="1" r:id="rIdpdkbk51hvo4pdyqmbktmk">
+      <w:hyperlink w:history="1" r:id="rIdu6rblehjgrmyjzittttb9">
         <w:r>
           <w:rPr>
             <w:rStyle w:val="Hyperlink"/>
@@ -173,7 +173,7 @@
       <w:pPr>
         <w:spacing w:after="0" w:line="276"/>
       </w:pPr>
-      <w:hyperlink w:history="1" r:id="rIdaotvhyrsyqlguyrm57v43">
+      <w:hyperlink w:history="1" r:id="rIdvsjpfxno1qtk9dgg16plm">
         <w:r>
           <w:rPr>
             <w:rStyle w:val="Hyperlink"/>
@@ -194,7 +194,7 @@
         </w:rPr>
         <w:t xml:space="preserve"> and </w:t>
       </w:r>
-      <w:hyperlink w:history="1" r:id="rIdcsgpf-62vhozu0xcfp1sv">
+      <w:hyperlink w:history="1" r:id="rId4-lkmv4ikfokvpdc9-flq">
         <w:r>
           <w:rPr>
             <w:rStyle w:val="Hyperlink"/>
@@ -215,7 +215,7 @@
         </w:rPr>
         <w:t xml:space="preserve"> tied for second in Individual Net at 35 net (−1), Bryce from the Whites with a 38 (+2). </w:t>
       </w:r>
-      <w:hyperlink w:history="1" r:id="rIdhlinl3cqhr5ygactgsq_h">
+      <w:hyperlink w:history="1" r:id="rIdxetad0masbkjc8r7s-vlg">
         <w:r>
           <w:rPr>
             <w:rStyle w:val="Hyperlink"/>
@@ -236,7 +236,7 @@
         </w:rPr>
         <w:t xml:space="preserve"> won three skins in the second flight, including a birdie on the par-3 6th, and </w:t>
       </w:r>
-      <w:hyperlink w:history="1" r:id="rIdj4yik3oogybv8v8zqqzbq">
+      <w:hyperlink w:history="1" r:id="rIde1mxf-qkmatlwrztacuao">
         <w:r>
           <w:rPr>
             <w:rStyle w:val="Hyperlink"/>
@@ -257,7 +257,7 @@
         </w:rPr>
         <w:t xml:space="preserve">, </w:t>
       </w:r>
-      <w:hyperlink w:history="1" r:id="rIdmpl32qzeqdmjicikjzgdk">
+      <w:hyperlink w:history="1" r:id="rId6mmpzpe_jj6gvtyeygxn0">
         <w:r>
           <w:rPr>
             <w:rStyle w:val="Hyperlink"/>
@@ -278,7 +278,7 @@
         </w:rPr>
         <w:t xml:space="preserve"> and </w:t>
       </w:r>
-      <w:hyperlink w:history="1" r:id="rIdwoavz1rgumebwmav7d-pt">
+      <w:hyperlink w:history="1" r:id="rIdaymifo3y15b4ywwkecmfc">
         <w:r>
           <w:rPr>
             <w:rStyle w:val="Hyperlink"/>
@@ -299,7 +299,7 @@
         </w:rPr>
         <w:t xml:space="preserve"> took one each. </w:t>
       </w:r>
-      <w:hyperlink w:history="1" r:id="rIdfenepf4ap65rnsnioenmn">
+      <w:hyperlink w:history="1" r:id="rId9u1bwbw87zk59mhubu9n_">
         <w:r>
           <w:rPr>
             <w:rStyle w:val="Hyperlink"/>
@@ -338,7 +338,7 @@
       <w:pPr>
         <w:spacing w:after="0" w:line="276"/>
       </w:pPr>
-      <w:hyperlink w:history="1" r:id="rIdzpgkztl_vmippdczgkvde">
+      <w:hyperlink w:history="1" r:id="rId8fummvjeifc7qsw6vghzz">
         <w:r>
           <w:rPr>
             <w:rStyle w:val="Hyperlink"/>
@@ -393,7 +393,7 @@
       <w:pPr>
         <w:spacing w:after="0" w:line="276"/>
       </w:pPr>
-      <w:hyperlink w:history="1" r:id="rIdjqujv9gktohr5-v65enfm">
+      <w:hyperlink w:history="1" r:id="rIdlsqc1qjiz3ugkelgxfo96">
         <w:r>
           <w:rPr>
             <w:rStyle w:val="Hyperlink"/>
@@ -414,7 +414,7 @@
         </w:rPr>
         <w:t xml:space="preserve"> still leads at 62, with </w:t>
       </w:r>
-      <w:hyperlink w:history="1" r:id="rIdktmup9knvdiyv30gz5ayq">
+      <w:hyperlink w:history="1" r:id="rId5hkykitii0iy_xtli_hd1">
         <w:r>
           <w:rPr>
             <w:rStyle w:val="Hyperlink"/>
@@ -435,7 +435,7 @@
         </w:rPr>
         <w:t xml:space="preserve"> at 50, </w:t>
       </w:r>
-      <w:hyperlink w:history="1" r:id="rIdzdixsg6wq7srmwuwgjjx4">
+      <w:hyperlink w:history="1" r:id="rIdzvnt-ptyuk5dltmycamwt">
         <w:r>
           <w:rPr>
             <w:rStyle w:val="Hyperlink"/>
@@ -456,7 +456,7 @@
         </w:rPr>
         <w:t xml:space="preserve"> at 43 and </w:t>
       </w:r>
-      <w:hyperlink w:history="1" r:id="rIdgj8eoxmc5g4b-rsthoqw8">
+      <w:hyperlink w:history="1" r:id="rIduhi_ex_sigvezcc3gxewj">
         <w:r>
           <w:rPr>
             <w:rStyle w:val="Hyperlink"/>
@@ -477,7 +477,7 @@
         </w:rPr>
         <w:t xml:space="preserve"> at 35. Best 6 of the fall Tuesdays plus the Fall Championship at Kissing Tree on Oct 31. Your points are being tallied; activate them by </w:t>
       </w:r>
-      <w:hyperlink w:history="1" r:id="rId8d9ljbacuohcqcybpju_d">
+      <w:hyperlink w:history="1" r:id="rIdjazliuzstsahrxijrpfai">
         <w:r>
           <w:rPr>
             <w:rStyle w:val="Hyperlink"/>
@@ -516,7 +516,7 @@
       <w:pPr>
         <w:spacing w:after="0" w:line="276"/>
       </w:pPr>
-      <w:hyperlink w:history="1" w:anchor="race=fall_austin" r:id="rIdqwvnw09yw5tf_tml44ctq">
+      <w:hyperlink w:history="1" w:anchor="race=fall_austin" r:id="rIdpt-ypas-g_uhauoenil8j">
         <w:r>
           <w:rPr>
             <w:rStyle w:val="Hyperlink"/>
@@ -537,7 +537,7 @@
         </w:rPr>
         <w:t xml:space="preserve"> | </w:t>
       </w:r>
-      <w:hyperlink w:history="1" w:anchor="race=fall_sa" r:id="rIdoi6--hri0ygdr4qoswjwi">
+      <w:hyperlink w:history="1" w:anchor="race=fall_sa" r:id="rIdtktxs1tmybu2q-t-7zswb">
         <w:r>
           <w:rPr>
             <w:rStyle w:val="Hyperlink"/>
@@ -600,7 +600,7 @@
         </w:rPr>
         <w:t xml:space="preserve">Every member is in automatically, no buy-in required. Winner takes all — $139 at month end, $1 per TGF member. </w:t>
       </w:r>
-      <w:hyperlink w:history="1" r:id="rIdfmjz-n_7eitwvmvq0bhfl">
+      <w:hyperlink w:history="1" r:id="rIdfoyoismms9n0ezefq2op7">
         <w:r>
           <w:rPr>
             <w:rStyle w:val="Hyperlink"/>
@@ -621,7 +621,7 @@
         </w:rPr>
         <w:t xml:space="preserve"> leads with 22, with San Antonio's </w:t>
       </w:r>
-      <w:hyperlink w:history="1" r:id="rIdrzhestheb9_gtv75zjo3_">
+      <w:hyperlink w:history="1" r:id="rIdmzeq18ysuq2pnu5htylf7">
         <w:r>
           <w:rPr>
             <w:rStyle w:val="Hyperlink"/>
@@ -642,7 +642,7 @@
         </w:rPr>
         <w:t xml:space="preserve"> at 19 and </w:t>
       </w:r>
-      <w:hyperlink w:history="1" r:id="rIdk3u4ylql7lltwldnmhscp">
+      <w:hyperlink w:history="1" r:id="rId7qiu8bwwxquap5gv0d_i_">
         <w:r>
           <w:rPr>
             <w:rStyle w:val="Hyperlink"/>
@@ -661,7 +661,7 @@
           <w:sz w:val="22"/>
           <w:szCs w:val="22"/>
         </w:rPr>
-        <w:t xml:space="preserve"> tied for fourth at 17.</w:t>
+        <w:t xml:space="preserve"> tied for fifth at 17.</w:t>
       </w:r>
     </w:p>
     <w:p>
@@ -681,7 +681,7 @@
       <w:pPr>
         <w:spacing w:after="0" w:line="276"/>
       </w:pPr>
-      <w:hyperlink w:history="1" w:anchor="race=monthly" r:id="rIdfrq8mmhuxxlpqovuu8cum">
+      <w:hyperlink w:history="1" w:anchor="race=monthly" r:id="rIdatksb4nz-tiqthvtqossu">
         <w:r>
           <w:rPr>
             <w:rStyle w:val="Hyperlink"/>
@@ -903,7 +903,7 @@
         </w:rPr>
         <w:t xml:space="preserve"> | </w:t>
       </w:r>
-      <w:hyperlink w:history="1" r:id="rIdsqukg1orgxkssuxm8vtyp">
+      <w:hyperlink w:history="1" r:id="rId4blqubrgfi7baq63zjtiw">
         <w:r>
           <w:rPr>
             <w:rStyle w:val="Hyperlink"/>
@@ -960,7 +960,7 @@
         </w:rPr>
         <w:t xml:space="preserve"> | </w:t>
       </w:r>
-      <w:hyperlink w:history="1" r:id="rIdbwfsy2gn8uak_3mliqbye">
+      <w:hyperlink w:history="1" r:id="rIdrqf6jecwdeobexpwkxd0s">
         <w:r>
           <w:rPr>
             <w:rStyle w:val="Hyperlink"/>
@@ -1036,7 +1036,7 @@
         </w:rPr>
         <w:t xml:space="preserve"> | </w:t>
       </w:r>
-      <w:hyperlink w:history="1" r:id="rId-7xhijxbod-2czjh15big">
+      <w:hyperlink w:history="1" r:id="rIdmoug1ui2-wc0c8vdtasrl">
         <w:r>
           <w:rPr>
             <w:rStyle w:val="Hyperlink"/>
@@ -1103,7 +1103,7 @@
         </w:rPr>
         <w:t xml:space="preserve"> | Kissing Tree — both chapters | </w:t>
       </w:r>
-      <w:hyperlink w:history="1" r:id="rIdrszcfowykjml4rhktodnx">
+      <w:hyperlink w:history="1" r:id="rIdk223as_vhcczwcqg0y7am">
         <w:r>
           <w:rPr>
             <w:rStyle w:val="Hyperlink"/>

</xml_diff>